<commit_message>
feat(docx): Word auto-numbering, hidden meta toggle, and LaTeX list conversion.
Replace baked-in stem numbers with style-linked multilevel lists, gate BANK_META behind include_meta, convert LaTeX itemize/enumerate to markdown lists, and align style names with the house P-/Solution- taxonomy.
</commit_message>
<xml_diff>
--- a/backend/assets/quiz-template.docx
+++ b/backend/assets/quiz-template.docx
@@ -13,203 +13,38 @@
 </file>
 
 <file path=word/numbering.xml><?xml version="1.0" encoding="utf-8"?>
-<w:numbering xmlns:wpc="http://schemas.microsoft.com/office/word/2010/wordprocessingCanvas" xmlns:mo="http://schemas.microsoft.com/office/mac/office/2008/main" xmlns:mc="http://schemas.openxmlformats.org/markup-compatibility/2006" xmlns:mv="urn:schemas-microsoft-com:mac:vml" xmlns:o="urn:schemas-microsoft-com:office:office" xmlns:r="http://schemas.openxmlformats.org/officeDocument/2006/relationships" xmlns:m="http://schemas.openxmlformats.org/officeDocument/2006/math" xmlns:v="urn:schemas-microsoft-com:vml" xmlns:wp14="http://schemas.microsoft.com/office/word/2010/wordprocessingDrawing" xmlns:wp="http://schemas.openxmlformats.org/drawingml/2006/wordprocessingDrawing" xmlns:w10="urn:schemas-microsoft-com:office:word" xmlns:w="http://schemas.openxmlformats.org/wordprocessingml/2006/main" xmlns:w14="http://schemas.microsoft.com/office/word/2010/wordml" xmlns:wpg="http://schemas.microsoft.com/office/word/2010/wordprocessingGroup" xmlns:wpi="http://schemas.microsoft.com/office/word/2010/wordprocessingInk" xmlns:wne="http://schemas.microsoft.com/office/word/2006/wordml" xmlns:wps="http://schemas.microsoft.com/office/word/2010/wordprocessingShape" mc:Ignorable="w14 wp14">
+<w:numbering xmlns:w="http://schemas.openxmlformats.org/wordprocessingml/2006/main">
   <w:abstractNum w:abstractNumId="0">
-    <w:nsid w:val="FFFFFF7C"/>
-    <w:multiLevelType w:val="singleLevel"/>
-    <w:tmpl w:val="C310EC42"/>
+    <w:multiLevelType w:val="multilevel"/>
     <w:lvl w:ilvl="0">
       <w:start w:val="1"/>
       <w:numFmt w:val="decimal"/>
       <w:lvlText w:val="%1."/>
       <w:lvlJc w:val="left"/>
       <w:pPr>
-        <w:tabs>
-          <w:tab w:val="num" w:pos="1800"/>
-        </w:tabs>
-        <w:ind w:left="1800" w:hanging="360"/>
+        <w:ind w:left="360" w:hanging="360"/>
       </w:pPr>
     </w:lvl>
-  </w:abstractNum>
-  <w:abstractNum w:abstractNumId="1">
-    <w:nsid w:val="FFFFFF7D"/>
-    <w:multiLevelType w:val="singleLevel"/>
-    <w:tmpl w:val="E4089024"/>
-    <w:lvl w:ilvl="0">
+    <w:lvl w:ilvl="1">
       <w:start w:val="1"/>
-      <w:numFmt w:val="decimal"/>
-      <w:lvlText w:val="%1."/>
+      <w:numFmt w:val="lowerLetter"/>
+      <w:lvlText w:val="%2."/>
       <w:lvlJc w:val="left"/>
       <w:pPr>
-        <w:tabs>
-          <w:tab w:val="num" w:pos="1440"/>
-        </w:tabs>
-        <w:ind w:left="1440" w:hanging="360"/>
+        <w:ind w:left="720" w:hanging="360"/>
       </w:pPr>
     </w:lvl>
-  </w:abstractNum>
-  <w:abstractNum w:abstractNumId="2">
-    <w:nsid w:val="FFFFFF7E"/>
-    <w:multiLevelType w:val="singleLevel"/>
-    <w:tmpl w:val="FB12693A"/>
-    <w:lvl w:ilvl="0">
+    <w:lvl w:ilvl="2">
       <w:start w:val="1"/>
-      <w:numFmt w:val="decimal"/>
-      <w:pStyle w:val="ListNumber3"/>
-      <w:lvlText w:val="%1."/>
+      <w:numFmt w:val="lowerRoman"/>
+      <w:lvlText w:val="%3."/>
       <w:lvlJc w:val="left"/>
       <w:pPr>
-        <w:tabs>
-          <w:tab w:val="num" w:pos="1080"/>
-        </w:tabs>
         <w:ind w:left="1080" w:hanging="360"/>
       </w:pPr>
     </w:lvl>
   </w:abstractNum>
-  <w:abstractNum w:abstractNumId="3">
-    <w:nsid w:val="FFFFFF7F"/>
-    <w:multiLevelType w:val="singleLevel"/>
-    <w:tmpl w:val="38441652"/>
-    <w:lvl w:ilvl="0">
-      <w:start w:val="1"/>
-      <w:numFmt w:val="decimal"/>
-      <w:pStyle w:val="ListNumber2"/>
-      <w:lvlText w:val="%1."/>
-      <w:lvlJc w:val="left"/>
-      <w:pPr>
-        <w:tabs>
-          <w:tab w:val="num" w:pos="720"/>
-        </w:tabs>
-        <w:ind w:left="720" w:hanging="360"/>
-      </w:pPr>
-    </w:lvl>
-  </w:abstractNum>
-  <w:abstractNum w:abstractNumId="4">
-    <w:nsid w:val="FFFFFF81"/>
-    <w:multiLevelType w:val="singleLevel"/>
-    <w:tmpl w:val="171AC3A4"/>
-    <w:lvl w:ilvl="0">
-      <w:start w:val="1"/>
-      <w:numFmt w:val="bullet"/>
-      <w:lvlText w:val=""/>
-      <w:lvlJc w:val="left"/>
-      <w:pPr>
-        <w:tabs>
-          <w:tab w:val="num" w:pos="1440"/>
-        </w:tabs>
-        <w:ind w:left="1440" w:hanging="360"/>
-      </w:pPr>
-      <w:rPr>
-        <w:rFonts w:ascii="Symbol" w:hAnsi="Symbol" w:hint="default"/>
-      </w:rPr>
-    </w:lvl>
-  </w:abstractNum>
-  <w:abstractNum w:abstractNumId="5">
-    <w:nsid w:val="FFFFFF82"/>
-    <w:multiLevelType w:val="singleLevel"/>
-    <w:tmpl w:val="F3EAFDEC"/>
-    <w:lvl w:ilvl="0">
-      <w:start w:val="1"/>
-      <w:numFmt w:val="bullet"/>
-      <w:pStyle w:val="ListBullet3"/>
-      <w:lvlText w:val=""/>
-      <w:lvlJc w:val="left"/>
-      <w:pPr>
-        <w:tabs>
-          <w:tab w:val="num" w:pos="1080"/>
-        </w:tabs>
-        <w:ind w:left="1080" w:hanging="360"/>
-      </w:pPr>
-      <w:rPr>
-        <w:rFonts w:ascii="Symbol" w:hAnsi="Symbol" w:hint="default"/>
-      </w:rPr>
-    </w:lvl>
-  </w:abstractNum>
-  <w:abstractNum w:abstractNumId="6">
-    <w:nsid w:val="FFFFFF83"/>
-    <w:multiLevelType w:val="singleLevel"/>
-    <w:tmpl w:val="3D1EFFD4"/>
-    <w:lvl w:ilvl="0">
-      <w:start w:val="1"/>
-      <w:numFmt w:val="bullet"/>
-      <w:pStyle w:val="ListBullet2"/>
-      <w:lvlText w:val=""/>
-      <w:lvlJc w:val="left"/>
-      <w:pPr>
-        <w:tabs>
-          <w:tab w:val="num" w:pos="720"/>
-        </w:tabs>
-        <w:ind w:left="720" w:hanging="360"/>
-      </w:pPr>
-      <w:rPr>
-        <w:rFonts w:ascii="Symbol" w:hAnsi="Symbol" w:hint="default"/>
-      </w:rPr>
-    </w:lvl>
-  </w:abstractNum>
-  <w:abstractNum w:abstractNumId="7">
-    <w:nsid w:val="FFFFFF88"/>
-    <w:multiLevelType w:val="singleLevel"/>
-    <w:tmpl w:val="D0A62B40"/>
-    <w:lvl w:ilvl="0">
-      <w:start w:val="1"/>
-      <w:numFmt w:val="decimal"/>
-      <w:pStyle w:val="ListNumber"/>
-      <w:lvlText w:val="%1."/>
-      <w:lvlJc w:val="left"/>
-      <w:pPr>
-        <w:tabs>
-          <w:tab w:val="num" w:pos="360"/>
-        </w:tabs>
-        <w:ind w:left="360" w:hanging="360"/>
-      </w:pPr>
-    </w:lvl>
-  </w:abstractNum>
-  <w:abstractNum w:abstractNumId="8">
-    <w:nsid w:val="FFFFFF89"/>
-    <w:multiLevelType w:val="singleLevel"/>
-    <w:tmpl w:val="29761A62"/>
-    <w:lvl w:ilvl="0">
-      <w:start w:val="1"/>
-      <w:numFmt w:val="bullet"/>
-      <w:pStyle w:val="ListBullet"/>
-      <w:lvlText w:val=""/>
-      <w:lvlJc w:val="left"/>
-      <w:pPr>
-        <w:tabs>
-          <w:tab w:val="num" w:pos="360"/>
-        </w:tabs>
-        <w:ind w:left="360" w:hanging="360"/>
-      </w:pPr>
-      <w:rPr>
-        <w:rFonts w:ascii="Symbol" w:hAnsi="Symbol" w:hint="default"/>
-      </w:rPr>
-    </w:lvl>
-  </w:abstractNum>
   <w:num w:numId="1">
-    <w:abstractNumId w:val="8"/>
-  </w:num>
-  <w:num w:numId="2">
-    <w:abstractNumId w:val="6"/>
-  </w:num>
-  <w:num w:numId="3">
-    <w:abstractNumId w:val="5"/>
-  </w:num>
-  <w:num w:numId="4">
-    <w:abstractNumId w:val="4"/>
-  </w:num>
-  <w:num w:numId="5">
-    <w:abstractNumId w:val="7"/>
-  </w:num>
-  <w:num w:numId="6">
-    <w:abstractNumId w:val="3"/>
-  </w:num>
-  <w:num w:numId="7">
-    <w:abstractNumId w:val="2"/>
-  </w:num>
-  <w:num w:numId="8">
-    <w:abstractNumId w:val="1"/>
-  </w:num>
-  <w:num w:numId="9">
     <w:abstractNumId w:val="0"/>
   </w:num>
 </w:numbering>
@@ -375,9 +210,13 @@
     <w:name w:val="Normal"/>
     <w:qFormat/>
     <w:rsid w:val="00FC693F"/>
+    <w:pPr>
+      <w:spacing w:after="120"/>
+      <w:jc w:val="both"/>
+    </w:pPr>
     <w:rPr>
-      <w:rFonts w:ascii="Calibri" w:hAnsi="Calibri"/>
-      <w:sz w:val="22"/>
+      <w:rFonts w:ascii="LM Roman 10" w:hAnsi="LM Roman 10"/>
+      <w:sz w:val="20"/>
     </w:rPr>
   </w:style>
   <w:style w:type="paragraph" w:styleId="Header">
@@ -12062,18 +11901,43 @@
       </w:tcPr>
     </w:tblStylePr>
   </w:style>
+  <w:style w:type="paragraph" w:customStyle="1" w:styleId="P-Subject">
+    <w:name w:val="P - Subject"/>
+    <w:basedOn w:val="Normal"/>
+    <w:pPr>
+      <w:keepNext/>
+      <w:spacing w:before="240" w:after="120" w:line="240" w:lineRule="auto"/>
+      <w:jc w:val="both"/>
+    </w:pPr>
+    <w:rPr>
+      <w:rFonts w:ascii="LM Roman 10" w:hAnsi="LM Roman 10"/>
+      <w:b/>
+      <w:i w:val="0"/>
+      <w:vanish w:val="0"/>
+      <w:color w:val="2F5496"/>
+      <w:sz w:val="24"/>
+    </w:rPr>
+  </w:style>
   <w:style w:type="paragraph" w:customStyle="1" w:styleId="P-Problem">
     <w:name w:val="P - Problem"/>
     <w:basedOn w:val="Normal"/>
     <w:pPr>
       <w:keepNext/>
-      <w:spacing w:before="240" w:after="80" w:line="240" w:lineRule="auto"/>
+      <w:spacing w:before="120" w:after="0" w:line="240" w:lineRule="auto"/>
+      <w:ind w:left="360" w:hanging="360"/>
+      <w:jc w:val="both"/>
+      <w:numPr>
+        <w:ilvl w:val="0"/>
+        <w:numId w:val="1"/>
+      </w:numPr>
     </w:pPr>
     <w:rPr>
-      <w:rFonts w:ascii="Calibri" w:hAnsi="Calibri"/>
-      <w:b/>
+      <w:rFonts w:ascii="LM Roman 10" w:hAnsi="LM Roman 10"/>
+      <w:b w:val="0"/>
       <w:i w:val="0"/>
-      <w:sz w:val="22"/>
+      <w:vanish w:val="0"/>
+      <w:color w:val="2F5496"/>
+      <w:sz w:val="20"/>
     </w:rPr>
   </w:style>
   <w:style w:type="paragraph" w:customStyle="1" w:styleId="P-Sub-problem">
@@ -12081,28 +11945,78 @@
     <w:basedOn w:val="Normal"/>
     <w:pPr>
       <w:keepNext w:val="0"/>
-      <w:spacing w:before="0" w:after="40" w:line="240" w:lineRule="auto"/>
-      <w:ind w:left="432"/>
+      <w:spacing w:before="0" w:after="0" w:line="240" w:lineRule="auto"/>
+      <w:ind w:left="720" w:hanging="360"/>
+      <w:jc w:val="both"/>
+      <w:numPr>
+        <w:ilvl w:val="1"/>
+        <w:numId w:val="1"/>
+      </w:numPr>
     </w:pPr>
     <w:rPr>
-      <w:rFonts w:ascii="Calibri" w:hAnsi="Calibri"/>
+      <w:rFonts w:ascii="LM Roman 10" w:hAnsi="LM Roman 10"/>
       <w:b w:val="0"/>
       <w:i w:val="0"/>
-      <w:sz w:val="22"/>
+      <w:vanish w:val="0"/>
+      <w:color w:val="2F5496"/>
+      <w:sz w:val="20"/>
     </w:rPr>
   </w:style>
-  <w:style w:type="paragraph" w:customStyle="1" w:styleId="Problem-Meta">
-    <w:name w:val="Problem - Meta"/>
+  <w:style w:type="paragraph" w:customStyle="1" w:styleId="P-Sub-subProblem">
+    <w:name w:val="P - Sub-sub Problem"/>
+    <w:basedOn w:val="Normal"/>
+    <w:pPr>
+      <w:keepNext w:val="0"/>
+      <w:spacing w:before="0" w:after="0" w:line="240" w:lineRule="auto"/>
+      <w:ind w:left="1080" w:hanging="360"/>
+      <w:jc w:val="both"/>
+      <w:numPr>
+        <w:ilvl w:val="2"/>
+        <w:numId w:val="1"/>
+      </w:numPr>
+    </w:pPr>
+    <w:rPr>
+      <w:rFonts w:ascii="LM Roman 10" w:hAnsi="LM Roman 10"/>
+      <w:b w:val="0"/>
+      <w:i w:val="0"/>
+      <w:vanish w:val="0"/>
+      <w:color w:val="2F5496"/>
+      <w:sz w:val="20"/>
+    </w:rPr>
+  </w:style>
+  <w:style w:type="paragraph" w:customStyle="1" w:styleId="P-Passage">
+    <w:name w:val="P - Passage"/>
+    <w:basedOn w:val="Normal"/>
+    <w:pPr>
+      <w:keepNext w:val="0"/>
+      <w:spacing w:before="120" w:after="120" w:line="240" w:lineRule="auto"/>
+      <w:ind w:left="360"/>
+      <w:jc w:val="both"/>
+    </w:pPr>
+    <w:rPr>
+      <w:rFonts w:ascii="LM Roman 10" w:hAnsi="LM Roman 10"/>
+      <w:b w:val="0"/>
+      <w:i w:val="0"/>
+      <w:vanish w:val="0"/>
+      <w:color w:val="1A1A1A"/>
+      <w:sz w:val="20"/>
+    </w:rPr>
+  </w:style>
+  <w:style w:type="paragraph" w:customStyle="1" w:styleId="P-Meta">
+    <w:name w:val="P - Meta"/>
     <w:basedOn w:val="Normal"/>
     <w:pPr>
       <w:keepNext w:val="0"/>
       <w:spacing w:before="40" w:after="40" w:line="240" w:lineRule="auto"/>
+      <w:ind w:left="360"/>
+      <w:jc w:val="both"/>
     </w:pPr>
     <w:rPr>
-      <w:rFonts w:ascii="Calibri" w:hAnsi="Calibri"/>
+      <w:rFonts w:ascii="LM Roman 10" w:hAnsi="LM Roman 10"/>
       <w:b w:val="0"/>
       <w:i/>
-      <w:color w:val="888888"/>
+      <w:vanish/>
+      <w:color w:val="808080"/>
       <w:sz w:val="18"/>
     </w:rPr>
   </w:style>
@@ -12111,30 +12025,17 @@
     <w:basedOn w:val="Normal"/>
     <w:pPr>
       <w:keepNext/>
-      <w:spacing w:before="120" w:after="40" w:line="240" w:lineRule="auto"/>
+      <w:spacing w:before="120" w:after="120" w:line="240" w:lineRule="auto"/>
+      <w:ind w:left="360"/>
+      <w:jc w:val="both"/>
     </w:pPr>
     <w:rPr>
-      <w:rFonts w:ascii="Calibri" w:hAnsi="Calibri"/>
+      <w:rFonts w:ascii="LM Roman 10" w:hAnsi="LM Roman 10"/>
       <w:b/>
       <w:i w:val="0"/>
-      <w:color w:val="1B7F3B"/>
-      <w:sz w:val="22"/>
-    </w:rPr>
-  </w:style>
-  <w:style w:type="paragraph" w:customStyle="1" w:styleId="Blank-Key">
-    <w:name w:val="Blank - Key"/>
-    <w:basedOn w:val="Normal"/>
-    <w:pPr>
-      <w:keepNext w:val="0"/>
-      <w:spacing w:before="0" w:after="40" w:line="240" w:lineRule="auto"/>
-      <w:ind w:left="432"/>
-    </w:pPr>
-    <w:rPr>
-      <w:rFonts w:ascii="Calibri" w:hAnsi="Calibri"/>
-      <w:b w:val="0"/>
-      <w:i w:val="0"/>
-      <w:color w:val="1D4ED8"/>
-      <w:sz w:val="22"/>
+      <w:vanish w:val="0"/>
+      <w:color w:val="2F5496"/>
+      <w:sz w:val="20"/>
     </w:rPr>
   </w:style>
   <w:style w:type="paragraph" w:customStyle="1" w:styleId="Solution">
@@ -12142,15 +12043,53 @@
     <w:basedOn w:val="Normal"/>
     <w:pPr>
       <w:keepNext w:val="0"/>
-      <w:spacing w:before="0" w:after="80" w:line="240" w:lineRule="auto"/>
-      <w:ind w:left="432"/>
+      <w:spacing w:before="120" w:after="120" w:line="240" w:lineRule="auto"/>
+      <w:ind w:left="360"/>
+      <w:jc w:val="both"/>
     </w:pPr>
     <w:rPr>
-      <w:rFonts w:ascii="Calibri" w:hAnsi="Calibri"/>
+      <w:rFonts w:ascii="LM Roman 10" w:hAnsi="LM Roman 10"/>
       <w:b w:val="0"/>
       <w:i w:val="0"/>
-      <w:color w:val="333333"/>
-      <w:sz w:val="22"/>
+      <w:vanish w:val="0"/>
+      <w:color w:val="1F3864"/>
+      <w:sz w:val="20"/>
+    </w:rPr>
+  </w:style>
+  <w:style w:type="paragraph" w:customStyle="1" w:styleId="Solution-Key">
+    <w:name w:val="Solution - Key"/>
+    <w:basedOn w:val="Normal"/>
+    <w:pPr>
+      <w:keepNext w:val="0"/>
+      <w:spacing w:before="0" w:after="40" w:line="240" w:lineRule="auto"/>
+      <w:ind w:left="360"/>
+      <w:jc w:val="both"/>
+    </w:pPr>
+    <w:rPr>
+      <w:rFonts w:ascii="LM Roman 10" w:hAnsi="LM Roman 10"/>
+      <w:b/>
+      <w:i w:val="0"/>
+      <w:vanish w:val="0"/>
+      <w:color w:val="1F3864"/>
+      <w:sz w:val="20"/>
+    </w:rPr>
+  </w:style>
+  <w:style w:type="paragraph" w:customStyle="1" w:styleId="Solution-Step">
+    <w:name w:val="Solution - Step"/>
+    <w:basedOn w:val="Normal"/>
+    <w:pPr>
+      <w:keepNext w:val="0"/>
+      <w:spacing w:before="0" w:after="40" w:line="240" w:lineRule="auto"/>
+      <w:ind w:left="504"/>
+      <w:jc w:val="both"/>
+    </w:pPr>
+    <w:rPr>
+      <w:rFonts w:ascii="LM Roman 10" w:hAnsi="LM Roman 10"/>
+      <w:b w:val="0"/>
+      <w:i w:val="0"/>
+      <w:vanish w:val="0"/>
+      <w:color w:val="1F3864"/>
+      <w:sz w:val="20"/>
     </w:rPr>
   </w:style>
 </w:styles>

</xml_diff>